<commit_message>
feat(portfolio): case studies, UI, skills page, resume assets
- Refresh project markdown; remove aetem-v2-cop backend doc

- Add skills.vue, projectRouteSlug util, PROJECT_CASE_STUDY template

- Update components, pages, package.json; docx and resume_preview.md

Note: unpacked/ and unpacked_resume/ left untracked (docx extract artifacts).
Made-with: Cursor
</commit_message>
<xml_diff>
--- a/이력서_풀스택개발자_팀스파르타.docx
+++ b/이력서_풀스택개발자_팀스파르타.docx
@@ -15,7 +15,7 @@
           <w:sz w:val="52"/>
           <w:szCs w:val="52"/>
         </w:rPr>
-        <w:t xml:space="preserve">[이름]</w:t>
+        <w:t xml:space="preserve">이두현</w:t>
       </w:r>
     </w:p>
     <w:p>
@@ -29,7 +29,7 @@
           <w:sz w:val="24"/>
           <w:szCs w:val="24"/>
         </w:rPr>
-        <w:t xml:space="preserve">웹 풀스택 개발자  ·  경력 약 2년 3개월</w:t>
+        <w:t xml:space="preserve">웹 풀스택 개발자  ·  경력 약 3년 1개월</w:t>
       </w:r>
     </w:p>
     <w:tbl>
@@ -73,7 +73,7 @@
                 <w:sz w:val="19"/>
                 <w:szCs w:val="19"/>
               </w:rPr>
-              <w:t xml:space="preserve">📧  [이메일]</w:t>
+              <w:t xml:space="preserve">📧  eatdu0918@gmail.com</w:t>
             </w:r>
           </w:p>
           <w:p>
@@ -84,7 +84,7 @@
                 <w:sz w:val="19"/>
                 <w:szCs w:val="19"/>
               </w:rPr>
-              <w:t xml:space="preserve">📱  [연락처]</w:t>
+              <w:t xml:space="preserve">📱  010-8310-1753</w:t>
             </w:r>
           </w:p>
         </w:tc>
@@ -112,7 +112,7 @@
                 <w:sz w:val="19"/>
                 <w:szCs w:val="19"/>
               </w:rPr>
-              <w:t xml:space="preserve">🔗  GitHub: [GitHub URL]</w:t>
+              <w:t xml:space="preserve">🔗  GitHub: https://github.com/eatdu0918</w:t>
             </w:r>
           </w:p>
           <w:p>
@@ -185,16 +185,7 @@
           <w:sz w:val="20"/>
           <w:szCs w:val="20"/>
         </w:rPr>
-        <w:t xml:space="preserve">지도 기반 군사 지휘통제 시스템(C4I)에서 OpenLayers·Cesium 3D와 NATO 표준 전술 심볼(MIL-STD-2525D) 렌더링, 실시간 WebSocket 기반 아키텍처를 설계·구현했습니다. </w:t>
-      </w:r>
-      <w:r>
-        <w:rPr>
-          <w:rFonts w:ascii="Malgun Gothic" w:cs="Malgun Gothic" w:eastAsia="Malgun Gothic" w:hAnsi="Malgun Gothic"/>
-          <w:color w:val="1E293B"/>
-          <w:sz w:val="20"/>
-          <w:szCs w:val="20"/>
-        </w:rPr>
-        <w:t xml:space="preserve">영상·이미지 비식별화 SaaS(Heidi)에서는 Electron 데스크톱, Spring Boot 멀티모듈, RabbitMQ로 복수 AI 모델을 서비스에 연결하는 파이프라인을 직접 설계했습니다.</w:t>
+        <w:t>지도 기반 군사 지휘통제 시스템(C4I)에서 OpenLayers·Cesium 3D와 NATO 표준 전술 심볼(MIL-STD-2525D) 렌더링, 실시간 WebSocket 기반 아키텍처를 설계·구현했습니다. 영상·이미지 비식별화 SaaS(Heidi)에서는 Electron 데스크톱, Spring Boot 멀티모듈, RabbitMQ로 복수 AI 모델을 서비스에 연결하는 파이프라인을 직접 설계했습니다.</w:t>
       </w:r>
     </w:p>
     <w:p>
@@ -687,7 +678,7 @@
           <w:sz w:val="20"/>
           <w:szCs w:val="20"/>
         </w:rPr>
-        <w:t xml:space="preserve">	2023.03 ~ 현재  (약 2년 3개월)</w:t>
+        <w:t xml:space="preserve">	2023.03 ~ 현재  (약 3년 1개월)</w:t>
       </w:r>
     </w:p>
     <w:p>
@@ -731,7 +722,7 @@
           <w:sz w:val="20"/>
           <w:szCs w:val="20"/>
         </w:rPr>
-        <w:t xml:space="preserve">	2025.03 ~ 현재</w:t>
+        <w:t xml:space="preserve">	2025.12 ~ 현재</w:t>
       </w:r>
     </w:p>
     <w:p>
@@ -895,7 +886,7 @@
           <w:sz w:val="20"/>
           <w:szCs w:val="20"/>
         </w:rPr>
-        <w:t xml:space="preserve">	2024.06 ~ 2025.03</w:t>
+        <w:t xml:space="preserve">	2025.06 ~ 2025.11</w:t>
       </w:r>
     </w:p>
     <w:p>
@@ -1059,7 +1050,7 @@
           <w:sz w:val="20"/>
           <w:szCs w:val="20"/>
         </w:rPr>
-        <w:t xml:space="preserve">	2024.01 ~ 2025.06</w:t>
+        <w:t xml:space="preserve">	2024.04 ~ 2025.05</w:t>
       </w:r>
     </w:p>
     <w:p>
@@ -1223,7 +1214,7 @@
           <w:sz w:val="20"/>
           <w:szCs w:val="20"/>
         </w:rPr>
-        <w:t xml:space="preserve">	2023.03 ~ 2024.01</w:t>
+        <w:t xml:space="preserve">	2023.04 ~ 2024.03</w:t>
       </w:r>
     </w:p>
     <w:p>
@@ -1883,7 +1874,7 @@
                 <w:sz w:val="19"/>
                 <w:szCs w:val="19"/>
               </w:rPr>
-              <w:t xml:space="preserve">[YYYY.MM ~ YYYY.MM]</w:t>
+              <w:t xml:space="preserve">2012.03 ~ 2015.02</w:t>
             </w:r>
           </w:p>
         </w:tc>
@@ -1911,7 +1902,7 @@
                 <w:sz w:val="19"/>
                 <w:szCs w:val="19"/>
               </w:rPr>
-              <w:t xml:space="preserve">[대학교명 · 전공]</w:t>
+              <w:t xml:space="preserve">서울영상고등학교 - 영상경영학과</w:t>
             </w:r>
           </w:p>
         </w:tc>
@@ -1939,7 +1930,7 @@
                 <w:sz w:val="19"/>
                 <w:szCs w:val="19"/>
               </w:rPr>
-              <w:t xml:space="preserve">학사</w:t>
+              <w:t xml:space="preserve">졸업</w:t>
             </w:r>
           </w:p>
         </w:tc>
@@ -1967,7 +1958,7 @@
                 <w:sz w:val="19"/>
                 <w:szCs w:val="19"/>
               </w:rPr>
-              <w:t xml:space="preserve">[졸업 / 수료]</w:t>
+              <w:t xml:space="preserve">졸업</w:t>
             </w:r>
           </w:p>
         </w:tc>
@@ -1997,7 +1988,7 @@
                 <w:sz w:val="19"/>
                 <w:szCs w:val="19"/>
               </w:rPr>
-              <w:t xml:space="preserve">2025.01 ~ 2025.02</w:t>
+              <w:t xml:space="preserve">2022.03 ~ 2022.12</w:t>
             </w:r>
           </w:p>
         </w:tc>
@@ -2025,7 +2016,7 @@
                 <w:sz w:val="19"/>
                 <w:szCs w:val="19"/>
               </w:rPr>
-              <w:t xml:space="preserve">팀스파르타 — Spring Cloud MSA 과정</w:t>
+              <w:t xml:space="preserve">더좋은아카데미학원 - Java기반 웹 개발 교육</w:t>
             </w:r>
           </w:p>
         </w:tc>
@@ -2086,6 +2077,120 @@
           </w:p>
         </w:tc>
       </w:tr>
+      <w:tr>
+        <w:tc>
+          <w:tcPr>
+            <w:tcW w:type="dxa" w:w="2000"/>
+            <w:tcBorders>
+              <w:top w:val="single" w:color="CBD5E1" w:sz="1"/>
+              <w:left w:val="single" w:color="CBD5E1" w:sz="1"/>
+              <w:bottom w:val="single" w:color="CBD5E1" w:sz="1"/>
+              <w:right w:val="single" w:color="CBD5E1" w:sz="1"/>
+            </w:tcBorders>
+            <w:tcMar>
+              <w:top w:type="dxa" w:w="80"/>
+              <w:left w:type="dxa" w:w="120"/>
+              <w:bottom w:type="dxa" w:w="80"/>
+              <w:right w:type="dxa" w:w="80"/>
+            </w:tcMar>
+          </w:tcPr>
+          <w:p>
+            <w:r>
+              <w:rPr>
+                <w:rFonts w:ascii="Malgun Gothic" w:cs="Malgun Gothic" w:eastAsia="Malgun Gothic" w:hAnsi="Malgun Gothic"/>
+                <w:color w:val="64748B"/>
+                <w:sz w:val="19"/>
+                <w:szCs w:val="19"/>
+              </w:rPr>
+              <w:t xml:space="preserve">2025.10 ~ 2026.02</w:t>
+            </w:r>
+          </w:p>
+        </w:tc>
+        <w:tc>
+          <w:tcPr>
+            <w:tcW w:type="dxa" w:w="4500"/>
+            <w:tcBorders>
+              <w:top w:val="single" w:color="CBD5E1" w:sz="1"/>
+              <w:left w:val="single" w:color="CBD5E1" w:sz="1"/>
+              <w:bottom w:val="single" w:color="CBD5E1" w:sz="1"/>
+              <w:right w:val="single" w:color="CBD5E1" w:sz="1"/>
+            </w:tcBorders>
+            <w:tcMar>
+              <w:top w:type="dxa" w:w="80"/>
+              <w:left w:type="dxa" w:w="120"/>
+              <w:bottom w:type="dxa" w:w="80"/>
+              <w:right w:type="dxa" w:w="80"/>
+            </w:tcMar>
+          </w:tcPr>
+          <w:p>
+            <w:r>
+              <w:rPr>
+                <w:rFonts w:ascii="Malgun Gothic" w:cs="Malgun Gothic" w:eastAsia="Malgun Gothic" w:hAnsi="Malgun Gothic"/>
+                <w:color w:val="1E293B"/>
+                <w:sz w:val="19"/>
+                <w:szCs w:val="19"/>
+              </w:rPr>
+              <w:t xml:space="preserve">팀스파르타 — Spring Cloud MSA 과정</w:t>
+            </w:r>
+          </w:p>
+        </w:tc>
+        <w:tc>
+          <w:tcPr>
+            <w:tcW w:type="dxa" w:w="1600"/>
+            <w:tcBorders>
+              <w:top w:val="single" w:color="CBD5E1" w:sz="1"/>
+              <w:left w:val="single" w:color="CBD5E1" w:sz="1"/>
+              <w:bottom w:val="single" w:color="CBD5E1" w:sz="1"/>
+              <w:right w:val="single" w:color="CBD5E1" w:sz="1"/>
+            </w:tcBorders>
+            <w:tcMar>
+              <w:top w:type="dxa" w:w="80"/>
+              <w:left w:type="dxa" w:w="120"/>
+              <w:bottom w:type="dxa" w:w="80"/>
+              <w:right w:type="dxa" w:w="80"/>
+            </w:tcMar>
+          </w:tcPr>
+          <w:p>
+            <w:r>
+              <w:rPr>
+                <w:rFonts w:ascii="Malgun Gothic" w:cs="Malgun Gothic" w:eastAsia="Malgun Gothic" w:hAnsi="Malgun Gothic"/>
+                <w:color w:val="1E293B"/>
+                <w:sz w:val="19"/>
+                <w:szCs w:val="19"/>
+              </w:rPr>
+              <w:t xml:space="preserve">수료</w:t>
+            </w:r>
+          </w:p>
+        </w:tc>
+        <w:tc>
+          <w:tcPr>
+            <w:tcW w:type="dxa" w:w="1646"/>
+            <w:tcBorders>
+              <w:top w:val="single" w:color="CBD5E1" w:sz="1"/>
+              <w:left w:val="single" w:color="CBD5E1" w:sz="1"/>
+              <w:bottom w:val="single" w:color="CBD5E1" w:sz="1"/>
+              <w:right w:val="single" w:color="CBD5E1" w:sz="1"/>
+            </w:tcBorders>
+            <w:tcMar>
+              <w:top w:type="dxa" w:w="80"/>
+              <w:left w:type="dxa" w:w="120"/>
+              <w:bottom w:type="dxa" w:w="80"/>
+              <w:right w:type="dxa" w:w="80"/>
+            </w:tcMar>
+          </w:tcPr>
+          <w:p>
+            <w:r>
+              <w:rPr>
+                <w:rFonts w:ascii="Malgun Gothic" w:cs="Malgun Gothic" w:eastAsia="Malgun Gothic" w:hAnsi="Malgun Gothic"/>
+                <w:color w:val="1E293B"/>
+                <w:sz w:val="19"/>
+                <w:szCs w:val="19"/>
+              </w:rPr>
+              <w:t xml:space="preserve">수료</w:t>
+            </w:r>
+          </w:p>
+        </w:tc>
+      </w:tr>
     </w:tbl>
     <w:p>
       <w:pPr>
@@ -2128,7 +2233,7 @@
           <w:sz w:val="20"/>
           <w:szCs w:val="20"/>
         </w:rPr>
-        <w:t xml:space="preserve">[병역 사항 입력 — 예: 군필 (육군 병장, 20XX.XX ~ 20XX.XX)]</w:t>
+        <w:t xml:space="preserve">군필 (2017.06 ~ 2019.02)</w:t>
       </w:r>
     </w:p>
     <w:p>
@@ -2158,7 +2263,7 @@
           <w:sz w:val="20"/>
           <w:szCs w:val="20"/>
         </w:rPr>
-        <w:t xml:space="preserve">[자격증명, 취득일 — 없으면 삭제]</w:t>
+        <w:t xml:space="preserve">SQL 개발자, 2022.06 (한국데이터산업진흥원)</w:t>
       </w:r>
     </w:p>
     <w:sectPr>

</xml_diff>